<commit_message>
Tighten the design document and add model results to the README
Co-Authored-By: Claude Opus 5.5 <noreply@anthropic.com>
</commit_message>
<xml_diff>
--- a/docs/design.docx
+++ b/docs/design.docx
@@ -50,7 +50,7 @@
         <w:spacing w:after="120"/>
       </w:pPr>
       <w:r>
-        <w:t xml:space="preserve">8 sites have overlapping LiDAR + UAVSAR coverage, found by intersecting each LiDAR granule's real footprint polygon with UAVSAR's catalog — not by matching site names to campaign names, which turned out to be unreliable. A UAVSAR pair counts as a match when it overlaps the footprint and comes within 5 days of the LiDAR survey.</w:t>
+        <w:t xml:space="preserve">8 sites have overlapping LiDAR + UAVSAR coverage, found by intersecting each LiDAR granule's real footprint polygon with UAVSAR's catalog. A UAVSAR pair counts as a match when it overlaps the footprint and comes within 5 days of the LiDAR survey.</w:t>
       </w:r>
     </w:p>
     <w:tbl>
@@ -1169,7 +1169,7 @@
           </w:tcPr>
           <w:p>
             <w:r>
-              <w:t xml:space="preserve">Read the frozen product inventory and the LIDAR/UAVSAR match list; group by unique UAVSAR product so a shared flight is downloaded once, not once per site.</w:t>
+              <w:t xml:space="preserve">Read the frozen product inventory and the LIDAR/UAVSAR match list; group by unique UAVSAR product so a shared flight is downloaded once.</w:t>
             </w:r>
           </w:p>
         </w:tc>
@@ -1225,7 +1225,7 @@
           </w:tcPr>
           <w:p>
             <w:r>
-              <w:t xml:space="preserve">Download each unique product once, by its recorded product URL (found via footprint search — no campaign names).</w:t>
+              <w:t xml:space="preserve">Download each unique product once, by its recorded product URL (found via footprint search).</w:t>
             </w:r>
           </w:p>
         </w:tc>
@@ -1281,7 +1281,7 @@
           </w:tcPr>
           <w:p>
             <w:r>
-              <w:t xml:space="preserve">Stream the clipped, aligned arrays straight into each site's .h5 — no intermediate files on disk.</w:t>
+              <w:t xml:space="preserve">Stream the clipped, aligned arrays straight into each site's .h5.</w:t>
             </w:r>
           </w:p>
         </w:tc>
@@ -1369,7 +1369,7 @@
           </w:tcPr>
           <w:p>
             <w:r>
-              <w:t xml:space="preserve">Write &lt;site&gt;.enriched.h5 (never edit in place): clean the layers, regroup radar by acquisition, add slope, aspect, canopy fraction, coherence masks and incidence angles (4).</w:t>
+              <w:t xml:space="preserve">Write &lt;site&gt;.enriched.h5: clean the layers, regroup radar by acquisition, add slope, aspect, canopy fraction, coherence masks and incidence angles (4).</w:t>
             </w:r>
           </w:p>
         </w:tc>
@@ -1487,7 +1487,7 @@
         <w:spacing w:after="60"/>
       </w:pPr>
       <w:r>
-        <w:t xml:space="preserve">Stronger than “same projection”: the same row and column are the same ground location in every layer, checked programmatically on every array before a file is marked complete.</w:t>
+        <w:t xml:space="preserve">The same row and column are the same ground location in every layer, checked programmatically on every array before a file is marked complete.</w:t>
       </w:r>
     </w:p>
     <w:p>
@@ -1496,7 +1496,7 @@
         <w:ind w:left="360"/>
       </w:pPr>
       <w:r>
-        <w:t xml:space="preserve">Grand Mesa has no QSI DEM. Its reference is the 2016 lidar-derived snow-off DTM from the SnowEx HRSI collection (1 m, resampled to 3 m, EPSG:32612) — older than the 2017 and 2020 snow surveys it supports, and recorded as such.</w:t>
+        <w:t xml:space="preserve">Grand Mesa has no QSI DEM. Its reference is the 2016 lidar-derived snow-off DTM from the SnowEx HRSI collection (1 m, resampled to 3 m, EPSG:32612).</w:t>
       </w:r>
     </w:p>
     <w:p>
@@ -1546,7 +1546,7 @@
         <w:spacing w:after="60"/>
       </w:pPr>
       <w:r>
-        <w:t xml:space="preserve">The 3 m LIDAR grid is the common grid; UAVSAR is upsampled onto it. This resamples a coarser measurement onto a finer bookkeeping grid — it does not invent new detail — and UAVSAR's true resolution is stored as uavsar_native_resolution_m so it is never mistaken for a native 3 m measurement.</w:t>
+        <w:t xml:space="preserve">The 3 m LIDAR grid is the common grid; UAVSAR is upsampled onto it, and its native resolution is stored as uavsar_native_resolution_m.</w:t>
       </w:r>
     </w:p>
     <w:p>
@@ -1555,7 +1555,7 @@
         <w:ind w:left="360"/>
       </w:pPr>
       <w:r>
-        <w:t xml:space="preserve">Upsampling was kept over downsampling LIDAR to the radar grid: it preserves the LIDAR labels at full resolution, and models can still average to coarser blocks when training.</w:t>
+        <w:t xml:space="preserve">This keeps the LIDAR labels at full resolution; models can average to coarser blocks when training.</w:t>
       </w:r>
     </w:p>
     <w:p>
@@ -1624,7 +1624,7 @@
         <w:spacing w:after="60"/>
       </w:pPr>
       <w:r>
-        <w:t xml:space="preserve">In the base file, UAVSAR groups are named by site, source flight line and dates, not JPL's opaque product ID:</w:t>
+        <w:t xml:space="preserve">In the base file, UAVSAR groups are named by site, source flight line and dates:</w:t>
       </w:r>
     </w:p>
     <w:p>
@@ -1663,7 +1663,7 @@
         <w:spacing w:after="60"/>
       </w:pPr>
       <w:r>
-        <w:t xml:space="preserve">Original JPL product ID and ASF file ID kept as attributes for traceability, not used as group names.</w:t>
+        <w:t xml:space="preserve">Original JPL product ID and ASF file ID kept as attributes for traceability.</w:t>
       </w:r>
     </w:p>
     <w:p>
@@ -1676,7 +1676,7 @@
         <w:spacing w:after="60"/>
       </w:pPr>
       <w:r>
-        <w:t xml:space="preserve">Every group and array carries a plain-English description attribute plus units, grid and source lineage — readable without outside context or SAR background.</w:t>
+        <w:t xml:space="preserve">Every group and array carries a plain-English description attribute plus units, grid and source lineage.</w:t>
       </w:r>
     </w:p>
     <w:p>
@@ -1694,62 +1694,8 @@
     </w:p>
     <w:p>
       <w:pPr>
-        <w:spacing w:after="60"/>
-      </w:pPr>
-    </w:p>
-    <w:p>
-      <w:pPr>
-        <w:spacing w:after="60"/>
-      </w:pPr>
-    </w:p>
-    <w:p>
-      <w:pPr>
-        <w:spacing w:after="60"/>
-      </w:pPr>
-    </w:p>
-    <w:p>
-      <w:pPr>
-        <w:spacing w:after="60"/>
-      </w:pPr>
-    </w:p>
-    <w:p>
-      <w:pPr>
-        <w:spacing w:after="60"/>
-      </w:pPr>
-    </w:p>
-    <w:p>
-      <w:pPr>
-        <w:spacing w:after="60"/>
-      </w:pPr>
-    </w:p>
-    <w:p>
-      <w:pPr>
-        <w:spacing w:after="60"/>
-      </w:pPr>
-    </w:p>
-    <w:p>
-      <w:pPr>
-        <w:spacing w:after="60"/>
-      </w:pPr>
-    </w:p>
-    <w:p>
-      <w:pPr>
-        <w:spacing w:after="60"/>
-      </w:pPr>
-    </w:p>
-    <w:p>
-      <w:pPr>
-        <w:spacing w:after="60"/>
-      </w:pPr>
-    </w:p>
-    <w:p>
-      <w:pPr>
-        <w:spacing w:after="60"/>
-      </w:pPr>
-    </w:p>
-    <w:p>
-      <w:pPr>
         <w:pStyle w:val="Heading1"/>
+        <w:pageBreakBefore/>
         <w:spacing w:before="300" w:after="150"/>
       </w:pPr>
       <w:r>

</xml_diff>

<commit_message>
Correct the design document, README and limitations after a fact-check
Every statement was checked against the code, the frozen inventory, the
exported explorer pages and the released archive files.

Co-Authored-By: Claude Opus 5.5 <noreply@anthropic.com>
</commit_message>
<xml_diff>
--- a/docs/design.docx
+++ b/docs/design.docx
@@ -622,7 +622,7 @@
           </w:tcPr>
           <w:p>
             <w:r>
-              <w:t xml:space="preserve">DEM is the 2014 RCEW lidar DEM (1 m); no snow-depth survey exists</w:t>
+              <w:t xml:space="preserve">DEM is the 2014 RCEW lidar DEM (1 m); no snow-depth survey is in the archive</w:t>
             </w:r>
           </w:p>
         </w:tc>
@@ -642,7 +642,7 @@
         <w:spacing w:after="120"/>
       </w:pPr>
       <w:r>
-        <w:t xml:space="preserve">Sizes of the released v1.0.05 files. The archive is larger than the downloaded radar products (about 172 GB before clipping) because every layer is stored on the 3 m grid, finer than UAVSAR's native pixels, and Grand Mesa's grid alone holds 286 million cells.</w:t>
+        <w:t xml:space="preserve">Sizes of the released v1.0.05 files, in decimal GB. The archive is larger than the downloaded radar products (about 198 GB before clipping) because every layer is stored on the 3 m grid, finer than UAVSAR's native pixels, and Grand Mesa's grid alone holds 286 million cells.</w:t>
       </w:r>
     </w:p>
     <w:tbl>
@@ -1081,7 +1081,7 @@
         <w:spacing w:before="240" w:after="120"/>
       </w:pPr>
       <w:r>
-        <w:t>3.0 What the main script does, end to end</w:t>
+        <w:t>3.0 What the pipeline does, end to end</w:t>
       </w:r>
     </w:p>
     <w:tbl>
@@ -1169,7 +1169,7 @@
           </w:tcPr>
           <w:p>
             <w:r>
-              <w:t xml:space="preserve">Read the frozen product inventory and the LIDAR/UAVSAR match list; group by unique UAVSAR product so a shared flight is downloaded once.</w:t>
+              <w:t xml:space="preserve">Read the frozen product inventory and the LIDAR/UAVSAR match list; group by unique UAVSAR product so sites built in the same run download a shared flight once.</w:t>
             </w:r>
           </w:p>
         </w:tc>
@@ -1197,7 +1197,7 @@
           </w:tcPr>
           <w:p>
             <w:r>
-              <w:t xml:space="preserve">Derive the site's common grid from its reference DEM (3.2); read each DEM/SD/VH product, resample it onto the grid (3.4) and write it into the site's .h5.</w:t>
+              <w:t xml:space="preserve">Derive the site's common grid from its reference DEM (3.2); write identification/, resample each DEM/SD/VH product onto the grid (3.4), write it into the site's .h5, then write matches/.</w:t>
             </w:r>
           </w:p>
         </w:tc>
@@ -1253,7 +1253,7 @@
           </w:tcPr>
           <w:p>
             <w:r>
-              <w:t xml:space="preserve">Resample onto the common grid of every site sharing that product (3.2, 3.4), reading only the site's extent plus a 500 m buffer.</w:t>
+              <w:t xml:space="preserve">Resample onto the common grid of every site sharing that product (3.2, 3.4), reading only the site's extent plus an 8-pixel margin of the source raster.</w:t>
             </w:r>
           </w:p>
         </w:tc>
@@ -1329,7 +1329,7 @@
             <w:proofErr w:type="gramStart"/>
             <w:proofErr w:type="gramEnd"/>
             <w:r>
-              <w:t xml:space="preserve">7. Finalize</w:t>
+              <w:t xml:space="preserve">7. Check</w:t>
             </w:r>
           </w:p>
         </w:tc>
@@ -1339,7 +1339,7 @@
           </w:tcPr>
           <w:p>
             <w:r>
-              <w:t xml:space="preserve">Write identification/ and matches/; verify every array's shape + transform matches the site's common grid before marking the file complete.</w:t>
+              <w:t xml:space="preserve">--mode verify reopens a file and checks every array's shape, transform and CRS against the site's common grid.</w:t>
             </w:r>
           </w:p>
         </w:tc>
@@ -1431,7 +1431,7 @@
         <w:spacing w:after="60"/>
       </w:pPr>
       <w:r>
-        <w:t xml:space="preserve">Banner Summit, Dry Creek and Mores Creek are covered by the same UAVSAR flight lines (Lowman lines 05208 and 23205).</w:t>
+        <w:t xml:space="preserve">Banner Summit, Dry Creek and Mores Creek share UAVSAR flights on Lowman line 23205; Banner Summit and Mores Creek also share line 05208.</w:t>
       </w:r>
     </w:p>
     <w:p>
@@ -1474,7 +1474,7 @@
         <w:spacing w:after="60"/>
       </w:pPr>
       <w:r>
-        <w:t xml:space="preserve">Every array in a site's file (LIDAR and UAVSAR alike) shares one CRS, one affine transform, one pixel shape. The CRS, 3 m pixel size and pixel alignment come from the site's reference LiDAR DEM; the grid extent is where that DEM and the site's science data overlap.</w:t>
+        <w:t xml:space="preserve">Every array in a site's file (LIDAR and UAVSAR alike) shares one CRS, one affine transform, one pixel shape. The CRS and pixel alignment come from the site's reference LiDAR DEM, the pixel size is fixed at 3 m, and the grid extent is where that DEM and the site's science data overlap.</w:t>
       </w:r>
     </w:p>
     <w:p>
@@ -1487,7 +1487,7 @@
         <w:spacing w:after="60"/>
       </w:pPr>
       <w:r>
-        <w:t xml:space="preserve">The same row and column are the same ground location in every layer, checked programmatically on every array before a file is marked complete.</w:t>
+        <w:t xml:space="preserve">The same row and column are the same ground location in every layer; the verify and audit steps check every array's shape, transform and CRS against the grid.</w:t>
       </w:r>
     </w:p>
     <w:p>
@@ -1496,7 +1496,7 @@
         <w:ind w:left="360"/>
       </w:pPr>
       <w:r>
-        <w:t xml:space="preserve">Grand Mesa has no QSI DEM. Its reference is the 2016 lidar-derived snow-off DTM from the SnowEx HRSI collection (1 m, resampled to 3 m, EPSG:32612).</w:t>
+        <w:t xml:space="preserve">Grand Mesa's reference is the 2016 lidar-derived snow-off DTM from the SnowEx HRSI collection (1 m, resampled to 3 m, EPSG:32612).</w:t>
       </w:r>
     </w:p>
     <w:p>
@@ -1505,7 +1505,7 @@
         <w:ind w:left="360"/>
       </w:pPr>
       <w:r>
-        <w:t xml:space="preserve">Reynolds Creek has no snow-depth survey in the SnowEx collections. Its reference is the 2014 Reynolds Creek Experimental Watershed lidar DEM (1 m, resampled to 3 m, EPSG:26911), so the site carries terrain, vegetation and radar but no snow-depth labels.</w:t>
+        <w:t xml:space="preserve">Reynolds Creek has no snow-depth survey in the archive. Its reference is the 2014 Reynolds Creek Experimental Watershed lidar DEM (1 m, resampled to 3 m, EPSG:26911), so the site carries terrain, vegetation and radar but no snow-depth labels.</w:t>
       </w:r>
     </w:p>
     <w:p>
@@ -1533,7 +1533,7 @@
         <w:spacing w:after="60"/>
       </w:pPr>
       <w:r>
-        <w:t xml:space="preserve">LIDAR: QSI and ASO products are published at 3 m; Grand Mesa's DTM and Reynolds Creek's DEM are 1 m and are resampled to 3 m. UAVSAR: about 4.45 m × 6.18 m on the ground (non-square), recorded per product.</w:t>
+        <w:t xml:space="preserve">LIDAR: QSI and ASO products are published at 3 m; Grand Mesa's DTM and Reynolds Creek's DEM are 1 m and are resampled to 3 m. UAVSAR: 0.00005556° pixels, about 4.5 m × 6.2 m on the ground in Idaho and 4.8 m × 6.2 m in Colorado and Utah (non-square); every file records the nominal 4.45 m × 6.18 m.</w:t>
       </w:r>
     </w:p>
     <w:p>
@@ -1676,7 +1676,7 @@
         <w:spacing w:after="60"/>
       </w:pPr>
       <w:r>
-        <w:t xml:space="preserve">Every group and array carries a plain-English description attribute plus units, grid and source lineage.</w:t>
+        <w:t xml:space="preserve">Every science array carries a plain-English description attribute plus its grid and source lineage; derived layers also carry units.</w:t>
       </w:r>
     </w:p>
     <w:p>
@@ -1689,7 +1689,7 @@
         <w:spacing w:after="60"/>
       </w:pPr>
       <w:r>
-        <w:t xml:space="preserve">The overall structure (science data under science/, file-level metadata in a separate identification/ group) follows the layout NASA uses in NISAR HDF5 products.</w:t>
+        <w:t xml:space="preserve">The overall structure (science data under science/, file-level metadata in a separate identification/ group) borrows its group names from NISAR HDF5 products.</w:t>
       </w:r>
     </w:p>
     <w:p>
@@ -1714,7 +1714,7 @@
           <w:iCs/>
           <w:color w:val="666666"/>
         </w:rPr>
-        <w:t xml:space="preserve">Shown for Banner Summit's enriched file — 2 SD dates, 2 VH dates, DEM, derived layers and 11 UAVSAR acquisitions, on flight lines shared with Dry Creek and Mores Creek. The base file (banner_summit.h5) holds the same LIDAR arrays and stores radar by product type (INTERFEROMETRY_GRD/, AMPLITUDE_GRD/, DEM_TIFF/). Italic arrows explain what each item actually is.</w:t>
+        <w:t xml:space="preserve">Shown for Banner Summit's enriched file — 2 SD dates, 2 VH dates, DEM, derived layers and 11 UAVSAR acquisitions, on flight lines shared with Dry Creek and Mores Creek. The base file (banner_summit.h5) holds the same LIDAR layers before enrichment cleaning, snow-pit tables under insitu/, and radar by product type (INTERFEROMETRY_GRD/, AMPLITUDE_GRD/, DEM_TIFF/). Italic arrows explain what each item actually is.</w:t>
       </w:r>
     </w:p>
     <w:p>
@@ -2180,7 +2180,7 @@
           <w:sz w:val="18"/>
           <w:szCs w:val="18"/>
         </w:rPr>
-        <w:t xml:space="preserve">│         20200131_20200213/LOWMAN23205/</w:t>
+        <w:t xml:space="preserve">│         20200213_20200221/LOWMAN23205/</w:t>
       </w:r>
       <w:r>
         <w:rPr>
@@ -2190,7 +2190,7 @@
           <w:sz w:val="18"/>
           <w:szCs w:val="18"/>
         </w:rPr>
-        <w:t xml:space="preserve">   → one acquisition: the Lowman flight line, comparing Jan 31 to Feb 13, 2020</w:t>
+        <w:t xml:space="preserve">   → one acquisition: the Lowman flight line, comparing Feb 13 to Feb 21, 2020</w:t>
       </w:r>
     </w:p>
     <w:p>
@@ -2387,7 +2387,7 @@
           <w:sz w:val="18"/>
           <w:szCs w:val="18"/>
         </w:rPr>
-        <w:t xml:space="preserve">│           HV/, VH/, VV/  (same 6)</w:t>
+        <w:t xml:space="preserve">│           HV/, VH/, VV/  (same arrays)</w:t>
       </w:r>
       <w:r>
         <w:rPr>
@@ -2397,7 +2397,7 @@
           <w:sz w:val="18"/>
           <w:szCs w:val="18"/>
         </w:rPr>
-        <w:t xml:space="preserve">   → the other send/receive combinations, where the flight recorded them</w:t>
+        <w:t xml:space="preserve">   → the other send/receive combinations, where the flight recorded them; a few pairs have no unw</w:t>
       </w:r>
     </w:p>
     <w:p>

</xml_diff>